<commit_message>
updated viz size and borders
</commit_message>
<xml_diff>
--- a/resources/notes.docx
+++ b/resources/notes.docx
@@ -528,6 +528,107 @@
         <w:t>dataframe</w:t>
       </w:r>
       <w:proofErr w:type="spellEnd"/>
+    </w:p>
+    <w:p>
+      <w:r>
+        <w:t>New iteration updates:</w:t>
+      </w:r>
+    </w:p>
+    <w:p>
+      <w:pPr>
+        <w:pStyle w:val="ListParagraph"/>
+        <w:numPr>
+          <w:ilvl w:val="0"/>
+          <w:numId w:val="8"/>
+        </w:numPr>
+      </w:pPr>
+      <w:r>
+        <w:t>Fix the display canvas</w:t>
+      </w:r>
+    </w:p>
+    <w:p>
+      <w:pPr>
+        <w:pStyle w:val="ListParagraph"/>
+        <w:numPr>
+          <w:ilvl w:val="0"/>
+          <w:numId w:val="8"/>
+        </w:numPr>
+      </w:pPr>
+      <w:r>
+        <w:t>Fix the edges</w:t>
+      </w:r>
+    </w:p>
+    <w:p>
+      <w:pPr>
+        <w:pStyle w:val="ListParagraph"/>
+        <w:numPr>
+          <w:ilvl w:val="0"/>
+          <w:numId w:val="8"/>
+        </w:numPr>
+      </w:pPr>
+      <w:r>
+        <w:t>Figure out if there is a pop-up page that can be automated for all nodes</w:t>
+      </w:r>
+    </w:p>
+    <w:p>
+      <w:pPr>
+        <w:pStyle w:val="ListParagraph"/>
+        <w:numPr>
+          <w:ilvl w:val="0"/>
+          <w:numId w:val="8"/>
+        </w:numPr>
+      </w:pPr>
+      <w:r>
+        <w:t>Link the different data sets</w:t>
+      </w:r>
+    </w:p>
+    <w:p>
+      <w:pPr>
+        <w:pStyle w:val="ListParagraph"/>
+        <w:numPr>
+          <w:ilvl w:val="0"/>
+          <w:numId w:val="8"/>
+        </w:numPr>
+      </w:pPr>
+      <w:r>
+        <w:t>Link the country selection</w:t>
+      </w:r>
+    </w:p>
+    <w:p>
+      <w:pPr>
+        <w:pStyle w:val="ListParagraph"/>
+        <w:numPr>
+          <w:ilvl w:val="0"/>
+          <w:numId w:val="8"/>
+        </w:numPr>
+      </w:pPr>
+      <w:r>
+        <w:t>Fix the year slide</w:t>
+      </w:r>
+    </w:p>
+    <w:p>
+      <w:pPr>
+        <w:pStyle w:val="ListParagraph"/>
+        <w:numPr>
+          <w:ilvl w:val="0"/>
+          <w:numId w:val="8"/>
+        </w:numPr>
+      </w:pPr>
+      <w:r>
+        <w:t>Update the title to update based on data</w:t>
+      </w:r>
+    </w:p>
+    <w:p>
+      <w:pPr>
+        <w:pStyle w:val="ListParagraph"/>
+        <w:numPr>
+          <w:ilvl w:val="0"/>
+          <w:numId w:val="8"/>
+        </w:numPr>
+      </w:pPr>
+      <w:r>
+        <w:t>Re-evaluate</w:t>
+      </w:r>
     </w:p>
     <w:sectPr>
       <w:pgSz w:w="12240" w:h="15840"/>
@@ -542,6 +643,119 @@
 <file path=word/numbering.xml><?xml version="1.0" encoding="utf-8"?>
 <w:numbering xmlns:wpc="http://schemas.microsoft.com/office/word/2010/wordprocessingCanvas" xmlns:cx="http://schemas.microsoft.com/office/drawing/2014/chartex" xmlns:cx1="http://schemas.microsoft.com/office/drawing/2015/9/8/chartex" xmlns:cx2="http://schemas.microsoft.com/office/drawing/2015/10/21/chartex" xmlns:cx3="http://schemas.microsoft.com/office/drawing/2016/5/9/chartex" xmlns:cx4="http://schemas.microsoft.com/office/drawing/2016/5/10/chartex" xmlns:cx5="http://schemas.microsoft.com/office/drawing/2016/5/11/chartex" xmlns:cx6="http://schemas.microsoft.com/office/drawing/2016/5/12/chartex" xmlns:cx7="http://schemas.microsoft.com/office/drawing/2016/5/13/chartex" xmlns:cx8="http://schemas.microsoft.com/office/drawing/2016/5/14/chartex" xmlns:mc="http://schemas.openxmlformats.org/markup-compatibility/2006" xmlns:aink="http://schemas.microsoft.com/office/drawing/2016/ink" xmlns:am3d="http://schemas.microsoft.com/office/drawing/2017/model3d" xmlns:o="urn:schemas-microsoft-com:office:office" xmlns:oel="http://schemas.microsoft.com/office/2019/extlst" xmlns:r="http://schemas.openxmlformats.org/officeDocument/2006/relationships" xmlns:m="http://schemas.openxmlformats.org/officeDocument/2006/math" xmlns:v="urn:schemas-microsoft-com:vml" xmlns:wp14="http://schemas.microsoft.com/office/word/2010/wordprocessingDrawing" xmlns:wp="http://schemas.openxmlformats.org/drawingml/2006/wordprocessingDrawing" xmlns:w10="urn:schemas-microsoft-com:office:word" xmlns:w="http://schemas.openxmlformats.org/wordprocessingml/2006/main" xmlns:w14="http://schemas.microsoft.com/office/word/2010/wordml" xmlns:w15="http://schemas.microsoft.com/office/word/2012/wordml" xmlns:w16cex="http://schemas.microsoft.com/office/word/2018/wordml/cex" xmlns:w16cid="http://schemas.microsoft.com/office/word/2016/wordml/cid" xmlns:w16="http://schemas.microsoft.com/office/word/2018/wordml" xmlns:w16du="http://schemas.microsoft.com/office/word/2023/wordml/word16du" xmlns:w16sdtdh="http://schemas.microsoft.com/office/word/2020/wordml/sdtdatahash" xmlns:w16sdtfl="http://schemas.microsoft.com/office/word/2024/wordml/sdtformatlock" xmlns:w16se="http://schemas.microsoft.com/office/word/2015/wordml/symex" xmlns:wpg="http://schemas.microsoft.com/office/word/2010/wordprocessingGroup" xmlns:wpi="http://schemas.microsoft.com/office/word/2010/wordprocessingInk" xmlns:wne="http://schemas.microsoft.com/office/word/2006/wordml" xmlns:wps="http://schemas.microsoft.com/office/word/2010/wordprocessingShape" mc:Ignorable="w14 w15 w16se w16cid w16 w16cex w16sdtdh w16sdtfl w16du wp14">
   <w:abstractNum w:abstractNumId="0" w15:restartNumberingAfterBreak="0">
+    <w:nsid w:val="0F65388F"/>
+    <w:multiLevelType w:val="hybridMultilevel"/>
+    <w:tmpl w:val="F3E0703A"/>
+    <w:lvl w:ilvl="0" w:tplc="04090001">
+      <w:start w:val="1"/>
+      <w:numFmt w:val="bullet"/>
+      <w:lvlText w:val=""/>
+      <w:lvlJc w:val="left"/>
+      <w:pPr>
+        <w:ind w:left="720" w:hanging="360"/>
+      </w:pPr>
+      <w:rPr>
+        <w:rFonts w:ascii="Symbol" w:hAnsi="Symbol" w:hint="default"/>
+      </w:rPr>
+    </w:lvl>
+    <w:lvl w:ilvl="1" w:tplc="04090003" w:tentative="1">
+      <w:start w:val="1"/>
+      <w:numFmt w:val="bullet"/>
+      <w:lvlText w:val="o"/>
+      <w:lvlJc w:val="left"/>
+      <w:pPr>
+        <w:ind w:left="1440" w:hanging="360"/>
+      </w:pPr>
+      <w:rPr>
+        <w:rFonts w:ascii="Courier New" w:hAnsi="Courier New" w:cs="Courier New" w:hint="default"/>
+      </w:rPr>
+    </w:lvl>
+    <w:lvl w:ilvl="2" w:tplc="04090005" w:tentative="1">
+      <w:start w:val="1"/>
+      <w:numFmt w:val="bullet"/>
+      <w:lvlText w:val=""/>
+      <w:lvlJc w:val="left"/>
+      <w:pPr>
+        <w:ind w:left="2160" w:hanging="360"/>
+      </w:pPr>
+      <w:rPr>
+        <w:rFonts w:ascii="Wingdings" w:hAnsi="Wingdings" w:hint="default"/>
+      </w:rPr>
+    </w:lvl>
+    <w:lvl w:ilvl="3" w:tplc="04090001" w:tentative="1">
+      <w:start w:val="1"/>
+      <w:numFmt w:val="bullet"/>
+      <w:lvlText w:val=""/>
+      <w:lvlJc w:val="left"/>
+      <w:pPr>
+        <w:ind w:left="2880" w:hanging="360"/>
+      </w:pPr>
+      <w:rPr>
+        <w:rFonts w:ascii="Symbol" w:hAnsi="Symbol" w:hint="default"/>
+      </w:rPr>
+    </w:lvl>
+    <w:lvl w:ilvl="4" w:tplc="04090003" w:tentative="1">
+      <w:start w:val="1"/>
+      <w:numFmt w:val="bullet"/>
+      <w:lvlText w:val="o"/>
+      <w:lvlJc w:val="left"/>
+      <w:pPr>
+        <w:ind w:left="3600" w:hanging="360"/>
+      </w:pPr>
+      <w:rPr>
+        <w:rFonts w:ascii="Courier New" w:hAnsi="Courier New" w:cs="Courier New" w:hint="default"/>
+      </w:rPr>
+    </w:lvl>
+    <w:lvl w:ilvl="5" w:tplc="04090005" w:tentative="1">
+      <w:start w:val="1"/>
+      <w:numFmt w:val="bullet"/>
+      <w:lvlText w:val=""/>
+      <w:lvlJc w:val="left"/>
+      <w:pPr>
+        <w:ind w:left="4320" w:hanging="360"/>
+      </w:pPr>
+      <w:rPr>
+        <w:rFonts w:ascii="Wingdings" w:hAnsi="Wingdings" w:hint="default"/>
+      </w:rPr>
+    </w:lvl>
+    <w:lvl w:ilvl="6" w:tplc="04090001" w:tentative="1">
+      <w:start w:val="1"/>
+      <w:numFmt w:val="bullet"/>
+      <w:lvlText w:val=""/>
+      <w:lvlJc w:val="left"/>
+      <w:pPr>
+        <w:ind w:left="5040" w:hanging="360"/>
+      </w:pPr>
+      <w:rPr>
+        <w:rFonts w:ascii="Symbol" w:hAnsi="Symbol" w:hint="default"/>
+      </w:rPr>
+    </w:lvl>
+    <w:lvl w:ilvl="7" w:tplc="04090003" w:tentative="1">
+      <w:start w:val="1"/>
+      <w:numFmt w:val="bullet"/>
+      <w:lvlText w:val="o"/>
+      <w:lvlJc w:val="left"/>
+      <w:pPr>
+        <w:ind w:left="5760" w:hanging="360"/>
+      </w:pPr>
+      <w:rPr>
+        <w:rFonts w:ascii="Courier New" w:hAnsi="Courier New" w:cs="Courier New" w:hint="default"/>
+      </w:rPr>
+    </w:lvl>
+    <w:lvl w:ilvl="8" w:tplc="04090005" w:tentative="1">
+      <w:start w:val="1"/>
+      <w:numFmt w:val="bullet"/>
+      <w:lvlText w:val=""/>
+      <w:lvlJc w:val="left"/>
+      <w:pPr>
+        <w:ind w:left="6480" w:hanging="360"/>
+      </w:pPr>
+      <w:rPr>
+        <w:rFonts w:ascii="Wingdings" w:hAnsi="Wingdings" w:hint="default"/>
+      </w:rPr>
+    </w:lvl>
+  </w:abstractNum>
+  <w:abstractNum w:abstractNumId="1" w15:restartNumberingAfterBreak="0">
     <w:nsid w:val="3F847686"/>
     <w:multiLevelType w:val="hybridMultilevel"/>
     <w:tmpl w:val="95F41930"/>
@@ -654,7 +868,7 @@
       </w:rPr>
     </w:lvl>
   </w:abstractNum>
-  <w:abstractNum w:abstractNumId="1" w15:restartNumberingAfterBreak="0">
+  <w:abstractNum w:abstractNumId="2" w15:restartNumberingAfterBreak="0">
     <w:nsid w:val="4A281C30"/>
     <w:multiLevelType w:val="hybridMultilevel"/>
     <w:tmpl w:val="091A9EDA"/>
@@ -740,7 +954,120 @@
       </w:pPr>
     </w:lvl>
   </w:abstractNum>
-  <w:abstractNum w:abstractNumId="2" w15:restartNumberingAfterBreak="0">
+  <w:abstractNum w:abstractNumId="3" w15:restartNumberingAfterBreak="0">
+    <w:nsid w:val="4DE6303F"/>
+    <w:multiLevelType w:val="hybridMultilevel"/>
+    <w:tmpl w:val="2A8EFBC0"/>
+    <w:lvl w:ilvl="0" w:tplc="0409000F">
+      <w:start w:val="1"/>
+      <w:numFmt w:val="decimal"/>
+      <w:lvlText w:val="%1."/>
+      <w:lvlJc w:val="left"/>
+      <w:pPr>
+        <w:ind w:left="720" w:hanging="360"/>
+      </w:pPr>
+      <w:rPr>
+        <w:rFonts w:hint="default"/>
+      </w:rPr>
+    </w:lvl>
+    <w:lvl w:ilvl="1" w:tplc="FFFFFFFF" w:tentative="1">
+      <w:start w:val="1"/>
+      <w:numFmt w:val="bullet"/>
+      <w:lvlText w:val="o"/>
+      <w:lvlJc w:val="left"/>
+      <w:pPr>
+        <w:ind w:left="1440" w:hanging="360"/>
+      </w:pPr>
+      <w:rPr>
+        <w:rFonts w:ascii="Courier New" w:hAnsi="Courier New" w:cs="Courier New" w:hint="default"/>
+      </w:rPr>
+    </w:lvl>
+    <w:lvl w:ilvl="2" w:tplc="FFFFFFFF" w:tentative="1">
+      <w:start w:val="1"/>
+      <w:numFmt w:val="bullet"/>
+      <w:lvlText w:val=""/>
+      <w:lvlJc w:val="left"/>
+      <w:pPr>
+        <w:ind w:left="2160" w:hanging="360"/>
+      </w:pPr>
+      <w:rPr>
+        <w:rFonts w:ascii="Wingdings" w:hAnsi="Wingdings" w:hint="default"/>
+      </w:rPr>
+    </w:lvl>
+    <w:lvl w:ilvl="3" w:tplc="FFFFFFFF" w:tentative="1">
+      <w:start w:val="1"/>
+      <w:numFmt w:val="bullet"/>
+      <w:lvlText w:val=""/>
+      <w:lvlJc w:val="left"/>
+      <w:pPr>
+        <w:ind w:left="2880" w:hanging="360"/>
+      </w:pPr>
+      <w:rPr>
+        <w:rFonts w:ascii="Symbol" w:hAnsi="Symbol" w:hint="default"/>
+      </w:rPr>
+    </w:lvl>
+    <w:lvl w:ilvl="4" w:tplc="FFFFFFFF" w:tentative="1">
+      <w:start w:val="1"/>
+      <w:numFmt w:val="bullet"/>
+      <w:lvlText w:val="o"/>
+      <w:lvlJc w:val="left"/>
+      <w:pPr>
+        <w:ind w:left="3600" w:hanging="360"/>
+      </w:pPr>
+      <w:rPr>
+        <w:rFonts w:ascii="Courier New" w:hAnsi="Courier New" w:cs="Courier New" w:hint="default"/>
+      </w:rPr>
+    </w:lvl>
+    <w:lvl w:ilvl="5" w:tplc="FFFFFFFF" w:tentative="1">
+      <w:start w:val="1"/>
+      <w:numFmt w:val="bullet"/>
+      <w:lvlText w:val=""/>
+      <w:lvlJc w:val="left"/>
+      <w:pPr>
+        <w:ind w:left="4320" w:hanging="360"/>
+      </w:pPr>
+      <w:rPr>
+        <w:rFonts w:ascii="Wingdings" w:hAnsi="Wingdings" w:hint="default"/>
+      </w:rPr>
+    </w:lvl>
+    <w:lvl w:ilvl="6" w:tplc="FFFFFFFF" w:tentative="1">
+      <w:start w:val="1"/>
+      <w:numFmt w:val="bullet"/>
+      <w:lvlText w:val=""/>
+      <w:lvlJc w:val="left"/>
+      <w:pPr>
+        <w:ind w:left="5040" w:hanging="360"/>
+      </w:pPr>
+      <w:rPr>
+        <w:rFonts w:ascii="Symbol" w:hAnsi="Symbol" w:hint="default"/>
+      </w:rPr>
+    </w:lvl>
+    <w:lvl w:ilvl="7" w:tplc="FFFFFFFF" w:tentative="1">
+      <w:start w:val="1"/>
+      <w:numFmt w:val="bullet"/>
+      <w:lvlText w:val="o"/>
+      <w:lvlJc w:val="left"/>
+      <w:pPr>
+        <w:ind w:left="5760" w:hanging="360"/>
+      </w:pPr>
+      <w:rPr>
+        <w:rFonts w:ascii="Courier New" w:hAnsi="Courier New" w:cs="Courier New" w:hint="default"/>
+      </w:rPr>
+    </w:lvl>
+    <w:lvl w:ilvl="8" w:tplc="FFFFFFFF" w:tentative="1">
+      <w:start w:val="1"/>
+      <w:numFmt w:val="bullet"/>
+      <w:lvlText w:val=""/>
+      <w:lvlJc w:val="left"/>
+      <w:pPr>
+        <w:ind w:left="6480" w:hanging="360"/>
+      </w:pPr>
+      <w:rPr>
+        <w:rFonts w:ascii="Wingdings" w:hAnsi="Wingdings" w:hint="default"/>
+      </w:rPr>
+    </w:lvl>
+  </w:abstractNum>
+  <w:abstractNum w:abstractNumId="4" w15:restartNumberingAfterBreak="0">
     <w:nsid w:val="58CC5282"/>
     <w:multiLevelType w:val="hybridMultilevel"/>
     <w:tmpl w:val="0CEE7B18"/>
@@ -853,7 +1180,7 @@
       </w:rPr>
     </w:lvl>
   </w:abstractNum>
-  <w:abstractNum w:abstractNumId="3" w15:restartNumberingAfterBreak="0">
+  <w:abstractNum w:abstractNumId="5" w15:restartNumberingAfterBreak="0">
     <w:nsid w:val="61972846"/>
     <w:multiLevelType w:val="hybridMultilevel"/>
     <w:tmpl w:val="75747086"/>
@@ -939,7 +1266,7 @@
       </w:pPr>
     </w:lvl>
   </w:abstractNum>
-  <w:abstractNum w:abstractNumId="4" w15:restartNumberingAfterBreak="0">
+  <w:abstractNum w:abstractNumId="6" w15:restartNumberingAfterBreak="0">
     <w:nsid w:val="6B6E3236"/>
     <w:multiLevelType w:val="hybridMultilevel"/>
     <w:tmpl w:val="F8AC6ADA"/>
@@ -1052,7 +1379,7 @@
       </w:rPr>
     </w:lvl>
   </w:abstractNum>
-  <w:abstractNum w:abstractNumId="5" w15:restartNumberingAfterBreak="0">
+  <w:abstractNum w:abstractNumId="7" w15:restartNumberingAfterBreak="0">
     <w:nsid w:val="6F53230E"/>
     <w:multiLevelType w:val="hybridMultilevel"/>
     <w:tmpl w:val="25964C92"/>
@@ -1166,22 +1493,28 @@
     </w:lvl>
   </w:abstractNum>
   <w:num w:numId="1" w16cid:durableId="1378703848">
+    <w:abstractNumId w:val="7"/>
+  </w:num>
+  <w:num w:numId="2" w16cid:durableId="1804158204">
+    <w:abstractNumId w:val="2"/>
+  </w:num>
+  <w:num w:numId="3" w16cid:durableId="1031221616">
     <w:abstractNumId w:val="5"/>
   </w:num>
-  <w:num w:numId="2" w16cid:durableId="1804158204">
+  <w:num w:numId="4" w16cid:durableId="346713904">
+    <w:abstractNumId w:val="4"/>
+  </w:num>
+  <w:num w:numId="5" w16cid:durableId="1144155299">
+    <w:abstractNumId w:val="6"/>
+  </w:num>
+  <w:num w:numId="6" w16cid:durableId="1994212688">
     <w:abstractNumId w:val="1"/>
   </w:num>
-  <w:num w:numId="3" w16cid:durableId="1031221616">
+  <w:num w:numId="7" w16cid:durableId="1745180514">
+    <w:abstractNumId w:val="0"/>
+  </w:num>
+  <w:num w:numId="8" w16cid:durableId="411894337">
     <w:abstractNumId w:val="3"/>
-  </w:num>
-  <w:num w:numId="4" w16cid:durableId="346713904">
-    <w:abstractNumId w:val="2"/>
-  </w:num>
-  <w:num w:numId="5" w16cid:durableId="1144155299">
-    <w:abstractNumId w:val="4"/>
-  </w:num>
-  <w:num w:numId="6" w16cid:durableId="1994212688">
-    <w:abstractNumId w:val="0"/>
   </w:num>
 </w:numbering>
 </file>

</xml_diff>

<commit_message>
planning to transfer viz to javascript
</commit_message>
<xml_diff>
--- a/resources/notes.docx
+++ b/resources/notes.docx
@@ -545,6 +545,9 @@
       <w:r>
         <w:t>Fix the display canvas</w:t>
       </w:r>
+      <w:r>
+        <w:t xml:space="preserve"> (done)</w:t>
+      </w:r>
     </w:p>
     <w:p>
       <w:pPr>
@@ -555,7 +558,25 @@
         </w:numPr>
       </w:pPr>
       <w:r>
+        <w:t>Directional toggles</w:t>
+      </w:r>
+      <w:r>
+        <w:t xml:space="preserve"> </w:t>
+      </w:r>
+    </w:p>
+    <w:p>
+      <w:pPr>
+        <w:pStyle w:val="ListParagraph"/>
+        <w:numPr>
+          <w:ilvl w:val="0"/>
+          <w:numId w:val="8"/>
+        </w:numPr>
+      </w:pPr>
+      <w:r>
         <w:t>Fix the edges</w:t>
+      </w:r>
+      <w:r>
+        <w:t xml:space="preserve"> </w:t>
       </w:r>
     </w:p>
     <w:p>

</xml_diff>